<commit_message>
Bat buoc chi dung apply_filter_loop
</commit_message>
<xml_diff>
--- a/Huong_dan_code_va_repo.docx
+++ b/Huong_dan_code_va_repo.docx
@@ -1315,25 +1315,168 @@
           <w:bCs/>
           <w:b/>
         </w:rPr>
-        <w:t xml:space="preserve">Mọi task lọc bằng ma trận</w:t>
-      </w:r>
-      <w:r>
-        <w:t xml:space="preserve"> </w:t>
-      </w:r>
-      <w:r>
-        <w:t xml:space="preserve">(Task 4, 5, 6, 7, 8, 10, 11, 12, 13) dùng</w:t>
-      </w:r>
-      <w:r>
-        <w:t xml:space="preserve"> </w:t>
-      </w:r>
-      <w:r>
-        <w:rPr>
-          <w:rStyle w:val="VerbatimChar"/>
+        <w:t xml:space="preserve">BẮT BUỘC:</w:t>
+      </w:r>
+      <w:r>
+        <w:t xml:space="preserve"> </w:t>
+      </w:r>
+      <w:r>
+        <w:t xml:space="preserve">mọi task lọc bằng ma trận (Task 4, 5, 6, 7, 8, 10, 11, 12, 13)</w:t>
+      </w:r>
+      <w:r>
+        <w:t xml:space="preserve"> </w:t>
+      </w:r>
+      <w:r>
+        <w:rPr>
+          <w:bCs/>
+          <w:b/>
+        </w:rPr>
+        <w:t xml:space="preserve">chỉ được dùng</w:t>
+      </w:r>
+      <w:r>
+        <w:rPr>
+          <w:bCs/>
+          <w:b/>
+        </w:rPr>
+        <w:t xml:space="preserve"> </w:t>
+      </w:r>
+      <w:r>
+        <w:rPr>
+          <w:rStyle w:val="VerbatimChar"/>
+          <w:bCs/>
+          <w:b/>
         </w:rPr>
         <w:t xml:space="preserve">apply_filter_loop(ImJPG, M)</w:t>
       </w:r>
       <w:r>
-        <w:t xml:space="preserve">: đi qua từng pixel đúng như code vòng lặp của đề ở Task 4. Task 9 (</w:t>
+        <w:t xml:space="preserve">.</w:t>
+      </w:r>
+      <w:r>
+        <w:t xml:space="preserve"> </w:t>
+      </w:r>
+      <w:r>
+        <w:rPr>
+          <w:bCs/>
+          <w:b/>
+        </w:rPr>
+        <w:t xml:space="preserve">Không</w:t>
+      </w:r>
+      <w:r>
+        <w:t xml:space="preserve"> </w:t>
+      </w:r>
+      <w:r>
+        <w:t xml:space="preserve">dùng</w:t>
+      </w:r>
+      <w:r>
+        <w:t xml:space="preserve"> </w:t>
+      </w:r>
+      <w:r>
+        <w:rPr>
+          <w:rStyle w:val="VerbatimChar"/>
+        </w:rPr>
+        <w:t xml:space="preserve">apply_filter</w:t>
+      </w:r>
+      <w:r>
+        <w:t xml:space="preserve">,</w:t>
+      </w:r>
+      <w:r>
+        <w:t xml:space="preserve"> </w:t>
+      </w:r>
+      <w:r>
+        <w:rPr>
+          <w:bCs/>
+          <w:b/>
+        </w:rPr>
+        <w:t xml:space="preserve">không</w:t>
+      </w:r>
+      <w:r>
+        <w:t xml:space="preserve"> </w:t>
+      </w:r>
+      <w:r>
+        <w:t xml:space="preserve">tự nhân ma trận cho cả ảnh (</w:t>
+      </w:r>
+      <w:r>
+        <w:rPr>
+          <w:rStyle w:val="VerbatimChar"/>
+        </w:rPr>
+        <w:t xml:space="preserve">img @ M.T</w:t>
+      </w:r>
+      <w:r>
+        <w:t xml:space="preserve">,</w:t>
+      </w:r>
+      <w:r>
+        <w:t xml:space="preserve"> </w:t>
+      </w:r>
+      <w:r>
+        <w:rPr>
+          <w:rStyle w:val="VerbatimChar"/>
+        </w:rPr>
+        <w:t xml:space="preserve">np.dot</w:t>
+      </w:r>
+      <w:r>
+        <w:t xml:space="preserve">). Phần đầu file</w:t>
+      </w:r>
+      <w:r>
+        <w:t xml:space="preserve"> </w:t>
+      </w:r>
+      <w:r>
+        <w:rPr>
+          <w:bCs/>
+          <w:b/>
+        </w:rPr>
+        <w:t xml:space="preserve">không được còn hàm</w:t>
+      </w:r>
+      <w:r>
+        <w:rPr>
+          <w:bCs/>
+          <w:b/>
+        </w:rPr>
+        <w:t xml:space="preserve"> </w:t>
+      </w:r>
+      <w:r>
+        <w:rPr>
+          <w:rStyle w:val="VerbatimChar"/>
+          <w:bCs/>
+          <w:b/>
+        </w:rPr>
+        <w:t xml:space="preserve">apply_filter</w:t>
+      </w:r>
+      <w:r>
+        <w:t xml:space="preserve"> </w:t>
+      </w:r>
+      <w:r>
+        <w:t xml:space="preserve">(bản cũ, không vòng lặp): ai đã chép phải xóa.</w:t>
+      </w:r>
+      <w:r>
+        <w:t xml:space="preserve"> </w:t>
+      </w:r>
+      <w:r>
+        <w:rPr>
+          <w:rStyle w:val="VerbatimChar"/>
+        </w:rPr>
+        <w:t xml:space="preserve">ghep_file.py</w:t>
+      </w:r>
+      <w:r>
+        <w:t xml:space="preserve"> </w:t>
+      </w:r>
+      <w:r>
+        <w:t xml:space="preserve">sẽ báo</w:t>
+      </w:r>
+      <w:r>
+        <w:t xml:space="preserve"> </w:t>
+      </w:r>
+      <w:r>
+        <w:rPr>
+          <w:bCs/>
+          <w:b/>
+        </w:rPr>
+        <w:t xml:space="preserve">[Lỗi]</w:t>
+      </w:r>
+      <w:r>
+        <w:t xml:space="preserve"> </w:t>
+      </w:r>
+      <w:r>
+        <w:t xml:space="preserve">kèm tên người nếu vi phạm. Task 9 (</w:t>
       </w:r>
       <w:r>
         <w:rPr>
@@ -1342,7 +1485,7 @@
         <w:t xml:space="preserve">255 - ImJPG</w:t>
       </w:r>
       <w:r>
-        <w:t xml:space="preserve">) và Task 14 (Gamma) không phải nhân ma trận nên viết theo công thức của đề.</w:t>
+        <w:t xml:space="preserve">) và Task 14 (Gamma) viết theo công thức của đề.</w:t>
       </w:r>
     </w:p>
     <w:p>

</xml_diff>